<commit_message>
feat: complete Google Stitch white-theme integration, FastAPI REST API, and security suite
</commit_message>
<xml_diff>
--- a/SmartCredit_Loan_Approval_Project_Report.docx
+++ b/SmartCredit_Loan_Approval_Project_Report.docx
@@ -143,7 +143,7 @@
                 <w:color w:val="1F2937"/>
                 <w:sz w:val="20"/>
               </w:rPr>
-              <w:t>Python 3.14, Streamlit, Scikit-Learn, Plotly, Pandas</w:t>
+              <w:t>Python 3.14, FastAPI REST API, Google Stitch UI, Scikit-Learn, Pydantic, Pandas</w:t>
             </w:r>
           </w:p>
         </w:tc>
@@ -996,6 +996,150 @@
     </w:p>
     <w:p>
       <w:pPr>
+        <w:pStyle w:val="Heading2"/>
+        <w:spacing w:before="280" w:after="120"/>
+      </w:pPr>
+      <w:r>
+        <w:rPr>
+          <w:b/>
+          <w:color w:val="0E7490"/>
+          <w:sz w:val="28"/>
+        </w:rPr>
+        <w:t>View 4: Institutional Model Governance &amp; Cryptographic Audit Trail</w:t>
+      </w:r>
+    </w:p>
+    <w:p>
+      <w:pPr>
+        <w:jc w:val="center"/>
+      </w:pPr>
+    </w:p>
+    <w:p>
+      <w:r>
+        <w:drawing>
+          <wp:inline xmlns:a="http://schemas.openxmlformats.org/drawingml/2006/main" xmlns:pic="http://schemas.openxmlformats.org/drawingml/2006/picture">
+            <wp:extent cx="5669280" cy="5254306"/>
+            <wp:docPr id="4" name="Picture 4"/>
+            <wp:cNvGraphicFramePr>
+              <a:graphicFrameLocks noChangeAspect="1"/>
+            </wp:cNvGraphicFramePr>
+            <a:graphic>
+              <a:graphicData uri="http://schemas.openxmlformats.org/drawingml/2006/picture">
+                <pic:pic>
+                  <pic:nvPicPr>
+                    <pic:cNvPr id="0" name="screenshot_view4.png"/>
+                    <pic:cNvPicPr/>
+                  </pic:nvPicPr>
+                  <pic:blipFill>
+                    <a:blip r:embed="rId12"/>
+                    <a:stretch>
+                      <a:fillRect/>
+                    </a:stretch>
+                  </pic:blipFill>
+                  <pic:spPr>
+                    <a:xfrm>
+                      <a:off x="0" y="0"/>
+                      <a:ext cx="5669280" cy="5254306"/>
+                    </a:xfrm>
+                    <a:prstGeom prst="rect"/>
+                  </pic:spPr>
+                </pic:pic>
+              </a:graphicData>
+            </a:graphic>
+          </wp:inline>
+        </w:drawing>
+      </w:r>
+    </w:p>
+    <w:p>
+      <w:pPr>
+        <w:jc w:val="center"/>
+      </w:pPr>
+      <w:r>
+        <w:rPr>
+          <w:i/>
+          <w:color w:val="6B7280"/>
+          <w:sz w:val="18"/>
+        </w:rPr>
+        <w:t>Figure 4: Model Governance Terminal showing multi-model benchmarks, SHAP feature importance, fairness audit (Bias Index 0.002), and SHA-256 tamper-evident ledger.</w:t>
+      </w:r>
+    </w:p>
+    <w:p>
+      <w:pPr>
+        <w:pStyle w:val="Heading2"/>
+        <w:spacing w:before="280" w:after="120"/>
+      </w:pPr>
+      <w:r>
+        <w:rPr>
+          <w:b/>
+          <w:color w:val="0E7490"/>
+          <w:sz w:val="28"/>
+        </w:rPr>
+        <w:t>API &amp; Cybersecurity Safeguards Verification</w:t>
+      </w:r>
+    </w:p>
+    <w:p>
+      <w:r>
+        <w:t>To ensure regulatory compliance (Basel III, OCC 2011-12, SR 11-7) and production reliability, the underlying FastAPI backend incorporates institutional-grade security mechanisms:</w:t>
+        <w:br/>
+      </w:r>
+    </w:p>
+    <w:p>
+      <w:pPr>
+        <w:pStyle w:val="ListBullet"/>
+      </w:pPr>
+      <w:r>
+        <w:rPr>
+          <w:b/>
+        </w:rPr>
+        <w:t xml:space="preserve">Strict Pydantic Contract Validation: </w:t>
+      </w:r>
+      <w:r>
+        <w:t>All incoming underwriting payloads are strictly validated against numeric boundaries (income, term, requested capital) and categorical regex patterns to neutralize injection vulnerabilities.</w:t>
+      </w:r>
+    </w:p>
+    <w:p>
+      <w:pPr>
+        <w:pStyle w:val="ListBullet"/>
+      </w:pPr>
+      <w:r>
+        <w:rPr>
+          <w:b/>
+        </w:rPr>
+        <w:t xml:space="preserve">Sliding-Window Rate Limiting: </w:t>
+      </w:r>
+      <w:r>
+        <w:t>The underwriting endpoint (/api/underwrite) is protected by an in-memory sliding-window rate limiter restricted to 40 requests/minute per client IP to mitigate denial-of-service attempts.</w:t>
+      </w:r>
+    </w:p>
+    <w:p>
+      <w:pPr>
+        <w:pStyle w:val="ListBullet"/>
+      </w:pPr>
+      <w:r>
+        <w:rPr>
+          <w:b/>
+        </w:rPr>
+        <w:t xml:space="preserve">Cybersecurity Headers Middleware: </w:t>
+      </w:r>
+      <w:r>
+        <w:t>Every HTTP response automatically enforces X-Content-Type-Options: nosniff, X-Frame-Options: DENY, X-XSS-Protection: 1; mode=block, Referrer-Policy, and HSTS.</w:t>
+      </w:r>
+    </w:p>
+    <w:p>
+      <w:pPr>
+        <w:pStyle w:val="ListBullet"/>
+      </w:pPr>
+      <w:r>
+        <w:rPr>
+          <w:b/>
+        </w:rPr>
+        <w:t xml:space="preserve">Cryptographic SHA-256 Audit Trail: </w:t>
+      </w:r>
+      <w:r>
+        <w:t>Every automated underwriting decision is hashed in real-time with an immutable timestamp and application ID, creating an auditable ledger for supervisory bank examiners.</w:t>
+      </w:r>
+    </w:p>
+    <w:p>
+      <w:pPr>
         <w:pStyle w:val="Heading1"/>
         <w:spacing w:before="280" w:after="120"/>
       </w:pPr>

</xml_diff>

<commit_message>
feat: institutional underwriter authentication, profile HUD, and visual decluttering
</commit_message>
<xml_diff>
--- a/SmartCredit_Loan_Approval_Project_Report.docx
+++ b/SmartCredit_Loan_Approval_Project_Report.docx
@@ -813,7 +813,7 @@
       <w:r>
         <w:drawing>
           <wp:inline xmlns:a="http://schemas.openxmlformats.org/drawingml/2006/main" xmlns:pic="http://schemas.openxmlformats.org/drawingml/2006/picture">
-            <wp:extent cx="5669280" cy="5254306"/>
+            <wp:extent cx="5669280" cy="3543300"/>
             <wp:docPr id="1" name="Picture 1"/>
             <wp:cNvGraphicFramePr>
               <a:graphicFrameLocks noChangeAspect="1"/>
@@ -834,7 +834,7 @@
                   <pic:spPr>
                     <a:xfrm>
                       <a:off x="0" y="0"/>
-                      <a:ext cx="5669280" cy="5254306"/>
+                      <a:ext cx="5669280" cy="3543300"/>
                     </a:xfrm>
                     <a:prstGeom prst="rect"/>
                   </pic:spPr>
@@ -881,7 +881,7 @@
       <w:r>
         <w:drawing>
           <wp:inline xmlns:a="http://schemas.openxmlformats.org/drawingml/2006/main" xmlns:pic="http://schemas.openxmlformats.org/drawingml/2006/picture">
-            <wp:extent cx="5669280" cy="5254306"/>
+            <wp:extent cx="5669280" cy="3543300"/>
             <wp:docPr id="2" name="Picture 2"/>
             <wp:cNvGraphicFramePr>
               <a:graphicFrameLocks noChangeAspect="1"/>
@@ -902,7 +902,7 @@
                   <pic:spPr>
                     <a:xfrm>
                       <a:off x="0" y="0"/>
-                      <a:ext cx="5669280" cy="5254306"/>
+                      <a:ext cx="5669280" cy="3543300"/>
                     </a:xfrm>
                     <a:prstGeom prst="rect"/>
                   </pic:spPr>
@@ -949,7 +949,7 @@
       <w:r>
         <w:drawing>
           <wp:inline xmlns:a="http://schemas.openxmlformats.org/drawingml/2006/main" xmlns:pic="http://schemas.openxmlformats.org/drawingml/2006/picture">
-            <wp:extent cx="5669280" cy="5254306"/>
+            <wp:extent cx="5669280" cy="3543300"/>
             <wp:docPr id="3" name="Picture 3"/>
             <wp:cNvGraphicFramePr>
               <a:graphicFrameLocks noChangeAspect="1"/>
@@ -970,7 +970,7 @@
                   <pic:spPr>
                     <a:xfrm>
                       <a:off x="0" y="0"/>
-                      <a:ext cx="5669280" cy="5254306"/>
+                      <a:ext cx="5669280" cy="3543300"/>
                     </a:xfrm>
                     <a:prstGeom prst="rect"/>
                   </pic:spPr>
@@ -1017,7 +1017,7 @@
       <w:r>
         <w:drawing>
           <wp:inline xmlns:a="http://schemas.openxmlformats.org/drawingml/2006/main" xmlns:pic="http://schemas.openxmlformats.org/drawingml/2006/picture">
-            <wp:extent cx="5669280" cy="5254306"/>
+            <wp:extent cx="5669280" cy="3543300"/>
             <wp:docPr id="4" name="Picture 4"/>
             <wp:cNvGraphicFramePr>
               <a:graphicFrameLocks noChangeAspect="1"/>
@@ -1038,7 +1038,7 @@
                   <pic:spPr>
                     <a:xfrm>
                       <a:off x="0" y="0"/>
-                      <a:ext cx="5669280" cy="5254306"/>
+                      <a:ext cx="5669280" cy="3543300"/>
                     </a:xfrm>
                     <a:prstGeom prst="rect"/>
                   </pic:spPr>

</xml_diff>

<commit_message>
feat: indian banking localization, dedicated login/logout page, deep audit modal, and icon repairs
</commit_message>
<xml_diff>
--- a/SmartCredit_Loan_Approval_Project_Report.docx
+++ b/SmartCredit_Loan_Approval_Project_Report.docx
@@ -240,7 +240,7 @@
         <w:t xml:space="preserve">Level 1: Key Performance Indicators (KPIs): </w:t>
       </w:r>
       <w:r>
-        <w:t>Answers 'What is happening?' Tracks total loan application volume (800), aggregate portfolio approval rate (82.6%), total capital requested ($115.3M), and average loan ticket size ($144,125).</w:t>
+        <w:t>Answers 'What is happening?' Tracks total loan application volume (800), aggregate portfolio approval rate (82.6%), total capital underwritten (₹115.3 Crore), and average loan ticket size (₹14.4 Lakhs).</w:t>
       </w:r>
     </w:p>
     <w:p>
@@ -1078,7 +1078,7 @@
     </w:p>
     <w:p>
       <w:r>
-        <w:t>To ensure regulatory compliance (Basel III, OCC 2011-12, SR 11-7) and production reliability, the underlying FastAPI backend incorporates institutional-grade security mechanisms:</w:t>
+        <w:t>To ensure regulatory compliance (Reserve Bank of India IRACP Norms, RBI Digital Lending Master Directions 2025, and SR 11-7) and production reliability, the underlying FastAPI backend incorporates institutional-grade security mechanisms:</w:t>
         <w:br/>
       </w:r>
     </w:p>

</xml_diff>